<commit_message>
actualizando el punto 2
</commit_message>
<xml_diff>
--- a/proyecto Marta.docx
+++ b/proyecto Marta.docx
@@ -5701,15 +5701,7 @@
         <w:ind w:firstLine="720"/>
       </w:pPr>
       <w:r>
-        <w:t xml:space="preserve">Dado el problema del aumento de préstamos en concesión de beca del instituto y la creciente gestión </w:t>
-      </w:r>
-      <w:proofErr w:type="gramStart"/>
-      <w:r>
-        <w:t>del mismo</w:t>
-      </w:r>
-      <w:proofErr w:type="gramEnd"/>
-      <w:r>
-        <w:t xml:space="preserve"> se detecta una necesidad de minimizar costes y tiempos en la gestión de este proceso. El mismo empieza al comienzo del curso en septiembre con la determinación del alumnado que ha sido becado y los libros existentes en depósito del año anterior. Del mismo modo, se deben configurar los datos de los cursos y libros en este periodo. Una vez realizada la configuración el proceso de gestión es tedioso y farragoso, en el que se incluye quedar con los alumnos y firmar el contrato de cesión. Una vez finalizado el curso hay que recuperar estos libros y finalizar la cesión, comprobando que estén bien.</w:t>
+        <w:t>Dado el problema del aumento de préstamos en concesión de beca del instituto y la creciente gestión del mismo se detecta una necesidad de minimizar costes y tiempos en la gestión de este proceso. El mismo empieza al comienzo del curso en septiembre con la determinación del alumnado que ha sido becado y los libros existentes en depósito del año anterior. Del mismo modo, se deben configurar los datos de los cursos y libros en este periodo. Una vez realizada la configuración el proceso de gestión es tedioso y farragoso, en el que se incluye quedar con los alumnos y firmar el contrato de cesión. Una vez finalizado el curso hay que recuperar estos libros y finalizar la cesión, comprobando que estén bien.</w:t>
       </w:r>
     </w:p>
     <w:p/>
@@ -5854,9 +5846,9 @@
       </w:r>
     </w:p>
     <w:p/>
-    <w:bookmarkStart w:id="6" w:name="_Toc170148316" w:displacedByCustomXml="next"/>
+    <w:bookmarkStart w:id="6" w:name="_Toc170148631" w:displacedByCustomXml="next"/>
     <w:bookmarkStart w:id="7" w:name="_Toc49341785" w:displacedByCustomXml="next"/>
-    <w:bookmarkStart w:id="8" w:name="_Toc170148631" w:displacedByCustomXml="next"/>
+    <w:bookmarkStart w:id="8" w:name="_Toc170148316" w:displacedByCustomXml="next"/>
     <w:sdt>
       <w:sdtPr>
         <w:rPr>
@@ -5946,13 +5938,8 @@
         <w:t>Base de datos</w:t>
       </w:r>
       <w:r>
-        <w:t xml:space="preserve"> y programación de </w:t>
-      </w:r>
-      <w:proofErr w:type="gramStart"/>
-      <w:r>
-        <w:t>la misma</w:t>
-      </w:r>
-      <w:proofErr w:type="gramEnd"/>
+        <w:t xml:space="preserve"> y programación de la misma</w:t>
+      </w:r>
       <w:r>
         <w:t xml:space="preserve"> (Access)</w:t>
       </w:r>
@@ -6177,15 +6164,7 @@
         <w:t xml:space="preserve">el registro del préstamo de libros </w:t>
       </w:r>
       <w:r>
-        <w:t xml:space="preserve">de forma segura y eficiente a todas las familias del centro y a la vez mejore la gestión de </w:t>
-      </w:r>
-      <w:proofErr w:type="gramStart"/>
-      <w:r>
-        <w:t>las mismas</w:t>
-      </w:r>
-      <w:proofErr w:type="gramEnd"/>
-      <w:r>
-        <w:t xml:space="preserve"> por parte de </w:t>
+        <w:t xml:space="preserve">de forma segura y eficiente a todas las familias del centro y a la vez mejore la gestión de las mismas por parte de </w:t>
       </w:r>
       <w:r>
         <w:t xml:space="preserve">la </w:t>
@@ -6754,19 +6733,15 @@
                 <w:r>
                   <w:t xml:space="preserve">IDE para desarrollo </w:t>
                 </w:r>
-                <w:proofErr w:type="gramStart"/>
                 <w:r>
                   <w:t>PHP</w:t>
                 </w:r>
                 <w:r>
                   <w:t xml:space="preserve">  (</w:t>
                 </w:r>
-                <w:proofErr w:type="spellStart"/>
-                <w:proofErr w:type="gramEnd"/>
                 <w:r>
                   <w:t>PhpStorm</w:t>
                 </w:r>
-                <w:proofErr w:type="spellEnd"/>
                 <w:r>
                   <w:t>)</w:t>
                 </w:r>
@@ -6858,7 +6833,6 @@
                   </w:rPr>
                   <w:t xml:space="preserve">Bootstrap </w:t>
                 </w:r>
-                <w:proofErr w:type="gramStart"/>
                 <w:r>
                   <w:rPr>
                     <w:lang w:val="en-US"/>
@@ -6869,14 +6843,7 @@
                   <w:rPr>
                     <w:lang w:val="en-US"/>
                   </w:rPr>
-                  <w:t xml:space="preserve"> jQuery</w:t>
-                </w:r>
-                <w:proofErr w:type="gramEnd"/>
-                <w:r>
-                  <w:rPr>
-                    <w:lang w:val="en-US"/>
-                  </w:rPr>
-                  <w:t xml:space="preserve"> 3.</w:t>
+                  <w:t xml:space="preserve"> jQuery 3.</w:t>
                 </w:r>
                 <w:r>
                   <w:rPr>
@@ -6931,13 +6898,8 @@
                 <w:tcW w:w="7477" w:type="dxa"/>
               </w:tcPr>
               <w:p>
-                <w:proofErr w:type="spellStart"/>
                 <w:r>
-                  <w:t>Mysql</w:t>
-                </w:r>
-                <w:proofErr w:type="spellEnd"/>
-                <w:r>
-                  <w:t xml:space="preserve"> </w:t>
+                  <w:t xml:space="preserve">Mysql </w:t>
                 </w:r>
                 <w:r>
                   <w:t>8.2</w:t>
@@ -6946,16 +6908,7 @@
                   <w:t xml:space="preserve"> </w:t>
                 </w:r>
                 <w:r>
-                  <w:t xml:space="preserve">– </w:t>
-                </w:r>
-                <w:proofErr w:type="spellStart"/>
-                <w:proofErr w:type="gramStart"/>
-                <w:r>
-                  <w:t>MariaDB</w:t>
-                </w:r>
-                <w:proofErr w:type="spellEnd"/>
-                <w:r>
-                  <w:t xml:space="preserve"> </w:t>
+                  <w:t xml:space="preserve">– MariaDB </w:t>
                 </w:r>
                 <w:r>
                   <w:t xml:space="preserve"> co</w:t>
@@ -6966,7 +6919,6 @@
                 <w:r>
                   <w:t>patible</w:t>
                 </w:r>
-                <w:proofErr w:type="gramEnd"/>
               </w:p>
             </w:tc>
           </w:tr>
@@ -7056,13 +7008,8 @@
               </w:tcPr>
               <w:p>
                 <w:r>
-                  <w:t xml:space="preserve">Servidor web con </w:t>
+                  <w:t>Servidor web con cpanel</w:t>
                 </w:r>
-                <w:proofErr w:type="spellStart"/>
-                <w:r>
-                  <w:t>cpanel</w:t>
-                </w:r>
-                <w:proofErr w:type="spellEnd"/>
               </w:p>
             </w:tc>
           </w:tr>
@@ -7118,13 +7065,8 @@
               </w:tcPr>
               <w:p>
                 <w:r>
-                  <w:t xml:space="preserve">Servidor web con </w:t>
+                  <w:t>Servidor web con Mysql</w:t>
                 </w:r>
-                <w:proofErr w:type="spellStart"/>
-                <w:r>
-                  <w:t>Mysql</w:t>
-                </w:r>
-                <w:proofErr w:type="spellEnd"/>
                 <w:r>
                   <w:t xml:space="preserve"> </w:t>
                 </w:r>
@@ -7147,15 +7089,7 @@
               </w:tcPr>
               <w:p>
                 <w:r>
-                  <w:t xml:space="preserve">Un usuario de acceso a </w:t>
-                </w:r>
-                <w:proofErr w:type="spellStart"/>
-                <w:r>
-                  <w:t>Mysql</w:t>
-                </w:r>
-                <w:proofErr w:type="spellEnd"/>
-                <w:r>
-                  <w:t xml:space="preserve"> independiente</w:t>
+                  <w:t>Un usuario de acceso a Mysql independiente</w:t>
                 </w:r>
                 <w:r>
                   <w:t xml:space="preserve"> y BBDD propia</w:t>
@@ -7350,11 +7284,9 @@
           <w:r>
             <w:t xml:space="preserve"> la compra del software de desarrollo </w:t>
           </w:r>
-          <w:proofErr w:type="spellStart"/>
           <w:r>
             <w:t>PHPStorm</w:t>
           </w:r>
-          <w:proofErr w:type="spellEnd"/>
           <w:r>
             <w:t xml:space="preserve"> con una licencia profesional.</w:t>
           </w:r>
@@ -7444,13 +7376,8 @@
           <w:pPr>
             <w:ind w:firstLine="720"/>
           </w:pPr>
-          <w:proofErr w:type="gramStart"/>
           <w:r>
-            <w:t>En caso que</w:t>
-          </w:r>
-          <w:proofErr w:type="gramEnd"/>
-          <w:r>
-            <w:t xml:space="preserve"> decidamos proporcionar esta aplicación a otros institutos, se deberá de tener en cuenta este punto</w:t>
+            <w:t>En caso que decidamos proporcionar esta aplicación a otros institutos, se deberá de tener en cuenta este punto</w:t>
           </w:r>
           <w:r>
             <w:t xml:space="preserve"> y realizar un </w:t>
@@ -8129,13 +8056,8 @@
           </w:tcPr>
           <w:p>
             <w:r>
-              <w:t xml:space="preserve">Da acceso al sistema para poder realizar el resto de </w:t>
-            </w:r>
-            <w:proofErr w:type="gramStart"/>
-            <w:r>
-              <w:t>acciones</w:t>
-            </w:r>
-            <w:proofErr w:type="gramEnd"/>
+              <w:t>Da acceso al sistema para poder realizar el resto de acciones</w:t>
+            </w:r>
             <w:r>
               <w:t>.</w:t>
             </w:r>
@@ -8528,35 +8450,7 @@
               <w:rPr>
                 <w:b/>
               </w:rPr>
-              <w:t xml:space="preserve">Cargar la BBDD       </w:t>
-            </w:r>
-            <w:proofErr w:type="spellStart"/>
-            <w:r>
-              <w:rPr>
-                <w:b/>
-              </w:rPr>
-              <w:t>subcaso</w:t>
-            </w:r>
-            <w:proofErr w:type="spellEnd"/>
-            <w:r>
-              <w:rPr>
-                <w:b/>
-              </w:rPr>
-              <w:t xml:space="preserve">: </w:t>
-            </w:r>
-            <w:proofErr w:type="spellStart"/>
-            <w:r>
-              <w:rPr>
-                <w:b/>
-              </w:rPr>
-              <w:t>Gestion</w:t>
-            </w:r>
-            <w:proofErr w:type="spellEnd"/>
-            <w:r>
-              <w:rPr>
-                <w:b/>
-              </w:rPr>
-              <w:t xml:space="preserve"> de errores</w:t>
+              <w:t>Cargar la BBDD       subcaso: Gestion de errores</w:t>
             </w:r>
           </w:p>
         </w:tc>
@@ -8697,14 +8591,12 @@
                 <w:b/>
               </w:rPr>
             </w:pPr>
-            <w:proofErr w:type="spellStart"/>
             <w:r>
               <w:rPr>
                 <w:b/>
               </w:rPr>
               <w:t>logout</w:t>
             </w:r>
-            <w:proofErr w:type="spellEnd"/>
           </w:p>
         </w:tc>
       </w:tr>
@@ -8867,15 +8759,7 @@
           </w:tcPr>
           <w:p>
             <w:r>
-              <w:t xml:space="preserve">Da acceso al sistema para poder realizar el resto de </w:t>
-            </w:r>
-            <w:proofErr w:type="gramStart"/>
-            <w:r>
-              <w:t>acciones</w:t>
-            </w:r>
-            <w:proofErr w:type="gramEnd"/>
-            <w:r>
-              <w:t>.</w:t>
+              <w:t>Da acceso al sistema para poder realizar el resto de acciones.</w:t>
             </w:r>
           </w:p>
         </w:tc>
@@ -9093,19 +8977,11 @@
               </w:rPr>
               <w:t xml:space="preserve">Filtrar </w:t>
             </w:r>
-            <w:proofErr w:type="spellStart"/>
-            <w:r>
-              <w:rPr>
-                <w:b/>
-              </w:rPr>
-              <w:t>subcaso</w:t>
-            </w:r>
-            <w:proofErr w:type="spellEnd"/>
-            <w:r>
-              <w:rPr>
-                <w:b/>
-              </w:rPr>
-              <w:t xml:space="preserve">: </w:t>
+            <w:r>
+              <w:rPr>
+                <w:b/>
+              </w:rPr>
+              <w:t xml:space="preserve">subcaso: </w:t>
             </w:r>
             <w:r>
               <w:rPr>
@@ -9252,19 +9128,11 @@
               </w:rPr>
               <w:t xml:space="preserve">Filtrar </w:t>
             </w:r>
-            <w:proofErr w:type="spellStart"/>
-            <w:r>
-              <w:rPr>
-                <w:b/>
-              </w:rPr>
-              <w:t>subcaso</w:t>
-            </w:r>
-            <w:proofErr w:type="spellEnd"/>
-            <w:r>
-              <w:rPr>
-                <w:b/>
-              </w:rPr>
-              <w:t xml:space="preserve">: </w:t>
+            <w:r>
+              <w:rPr>
+                <w:b/>
+              </w:rPr>
+              <w:t xml:space="preserve">subcaso: </w:t>
             </w:r>
             <w:r>
               <w:rPr>
@@ -9405,14 +9273,12 @@
                 <w:b/>
               </w:rPr>
             </w:pPr>
-            <w:proofErr w:type="spellStart"/>
             <w:r>
               <w:rPr>
                 <w:b/>
               </w:rPr>
               <w:t>logout</w:t>
             </w:r>
-            <w:proofErr w:type="spellEnd"/>
           </w:p>
         </w:tc>
       </w:tr>
@@ -9575,15 +9441,7 @@
           </w:tcPr>
           <w:p>
             <w:r>
-              <w:t xml:space="preserve">Da acceso al sistema para poder realizar el resto de </w:t>
-            </w:r>
-            <w:proofErr w:type="gramStart"/>
-            <w:r>
-              <w:t>acciones</w:t>
-            </w:r>
-            <w:proofErr w:type="gramEnd"/>
-            <w:r>
-              <w:t>.</w:t>
+              <w:t>Da acceso al sistema para poder realizar el resto de acciones.</w:t>
             </w:r>
           </w:p>
         </w:tc>
@@ -9799,21 +9657,7 @@
               <w:rPr>
                 <w:b/>
               </w:rPr>
-              <w:t xml:space="preserve">Buscar alumno </w:t>
-            </w:r>
-            <w:proofErr w:type="spellStart"/>
-            <w:r>
-              <w:rPr>
-                <w:b/>
-              </w:rPr>
-              <w:t>subcaso</w:t>
-            </w:r>
-            <w:proofErr w:type="spellEnd"/>
-            <w:r>
-              <w:rPr>
-                <w:b/>
-              </w:rPr>
-              <w:t>: asignar libros</w:t>
+              <w:t>Buscar alumno subcaso: asignar libros</w:t>
             </w:r>
           </w:p>
         </w:tc>
@@ -9958,21 +9802,7 @@
               <w:rPr>
                 <w:b/>
               </w:rPr>
-              <w:t xml:space="preserve">Buscar alumno </w:t>
-            </w:r>
-            <w:proofErr w:type="spellStart"/>
-            <w:r>
-              <w:rPr>
-                <w:b/>
-              </w:rPr>
-              <w:t>subcaso</w:t>
-            </w:r>
-            <w:proofErr w:type="spellEnd"/>
-            <w:r>
-              <w:rPr>
-                <w:b/>
-              </w:rPr>
-              <w:t>: cerrar préstamos</w:t>
+              <w:t>Buscar alumno subcaso: cerrar préstamos</w:t>
             </w:r>
           </w:p>
         </w:tc>
@@ -10117,21 +9947,7 @@
               <w:rPr>
                 <w:b/>
               </w:rPr>
-              <w:t xml:space="preserve">Buscar alumno </w:t>
-            </w:r>
-            <w:proofErr w:type="spellStart"/>
-            <w:r>
-              <w:rPr>
-                <w:b/>
-              </w:rPr>
-              <w:t>subcaso</w:t>
-            </w:r>
-            <w:proofErr w:type="spellEnd"/>
-            <w:r>
-              <w:rPr>
-                <w:b/>
-              </w:rPr>
-              <w:t>: firmar contrato</w:t>
+              <w:t>Buscar alumno subcaso: firmar contrato</w:t>
             </w:r>
           </w:p>
         </w:tc>
@@ -10272,14 +10088,12 @@
                 <w:b/>
               </w:rPr>
             </w:pPr>
-            <w:proofErr w:type="spellStart"/>
             <w:r>
               <w:rPr>
                 <w:b/>
               </w:rPr>
               <w:t>logout</w:t>
             </w:r>
-            <w:proofErr w:type="spellEnd"/>
           </w:p>
         </w:tc>
       </w:tr>
@@ -10460,15 +10274,7 @@
           </w:tcPr>
           <w:p>
             <w:r>
-              <w:t xml:space="preserve">Da acceso al sistema para poder realizar el resto de </w:t>
-            </w:r>
-            <w:proofErr w:type="gramStart"/>
-            <w:r>
-              <w:t>acciones</w:t>
-            </w:r>
-            <w:proofErr w:type="gramEnd"/>
-            <w:r>
-              <w:t>.</w:t>
+              <w:t>Da acceso al sistema para poder realizar el resto de acciones.</w:t>
             </w:r>
           </w:p>
         </w:tc>
@@ -10843,14 +10649,12 @@
                 <w:b/>
               </w:rPr>
             </w:pPr>
-            <w:proofErr w:type="spellStart"/>
             <w:r>
               <w:rPr>
                 <w:b/>
               </w:rPr>
               <w:t>logout</w:t>
             </w:r>
-            <w:proofErr w:type="spellEnd"/>
           </w:p>
         </w:tc>
       </w:tr>
@@ -11013,15 +10817,7 @@
           </w:tcPr>
           <w:p>
             <w:r>
-              <w:t xml:space="preserve">Da acceso al sistema para poder realizar el resto de </w:t>
-            </w:r>
-            <w:proofErr w:type="gramStart"/>
-            <w:r>
-              <w:t>acciones</w:t>
-            </w:r>
-            <w:proofErr w:type="gramEnd"/>
-            <w:r>
-              <w:t>.</w:t>
+              <w:t>Da acceso al sistema para poder realizar el resto de acciones.</w:t>
             </w:r>
           </w:p>
         </w:tc>
@@ -11152,21 +10948,7 @@
               <w:rPr>
                 <w:bCs/>
               </w:rPr>
-              <w:t xml:space="preserve">Se generará un fichero SQL-92 para preservar los datos. Se dará la posibilidad de exportarlos a </w:t>
-            </w:r>
-            <w:proofErr w:type="spellStart"/>
-            <w:r>
-              <w:rPr>
-                <w:bCs/>
-              </w:rPr>
-              <w:t>csv</w:t>
-            </w:r>
-            <w:proofErr w:type="spellEnd"/>
-            <w:r>
-              <w:rPr>
-                <w:bCs/>
-              </w:rPr>
-              <w:t xml:space="preserve"> también.</w:t>
+              <w:t>Se generará un fichero SQL-92 para preservar los datos. Se dará la posibilidad de exportarlos a csv también.</w:t>
             </w:r>
           </w:p>
         </w:tc>
@@ -11414,29 +11196,7 @@
               <w:rPr>
                 <w:b/>
               </w:rPr>
-              <w:t xml:space="preserve">Selección de </w:t>
-            </w:r>
-            <w:proofErr w:type="gramStart"/>
-            <w:r>
-              <w:rPr>
-                <w:b/>
-              </w:rPr>
-              <w:t xml:space="preserve">datos  </w:t>
-            </w:r>
-            <w:proofErr w:type="spellStart"/>
-            <w:r>
-              <w:rPr>
-                <w:b/>
-              </w:rPr>
-              <w:t>subcaso</w:t>
-            </w:r>
-            <w:proofErr w:type="spellEnd"/>
-            <w:proofErr w:type="gramEnd"/>
-            <w:r>
-              <w:rPr>
-                <w:b/>
-              </w:rPr>
-              <w:t>: Selección de formato</w:t>
+              <w:t>Selección de datos  subcaso: Selección de formato</w:t>
             </w:r>
           </w:p>
         </w:tc>
@@ -11496,35 +11256,7 @@
               <w:rPr>
                 <w:bCs/>
               </w:rPr>
-              <w:t xml:space="preserve">Se pedirá el formato y sus características para exportar: </w:t>
-            </w:r>
-            <w:proofErr w:type="spellStart"/>
-            <w:r>
-              <w:rPr>
-                <w:bCs/>
-              </w:rPr>
-              <w:t>json</w:t>
-            </w:r>
-            <w:proofErr w:type="spellEnd"/>
-            <w:r>
-              <w:rPr>
-                <w:bCs/>
-              </w:rPr>
-              <w:t xml:space="preserve">, </w:t>
-            </w:r>
-            <w:proofErr w:type="spellStart"/>
-            <w:r>
-              <w:rPr>
-                <w:bCs/>
-              </w:rPr>
-              <w:t>csv</w:t>
-            </w:r>
-            <w:proofErr w:type="spellEnd"/>
-            <w:r>
-              <w:rPr>
-                <w:bCs/>
-              </w:rPr>
-              <w:t>, sql-92</w:t>
+              <w:t>Se pedirá el formato y sus características para exportar: json, csv, sql-92</w:t>
             </w:r>
           </w:p>
         </w:tc>
@@ -11615,16 +11347,8 @@
               <w:rPr>
                 <w:b/>
               </w:rPr>
-              <w:t xml:space="preserve">datos </w:t>
-            </w:r>
-            <w:proofErr w:type="spellStart"/>
-            <w:r>
-              <w:rPr>
-                <w:b/>
-              </w:rPr>
-              <w:t>subcaso</w:t>
-            </w:r>
-            <w:proofErr w:type="spellEnd"/>
+              <w:t>datos subcaso</w:t>
+            </w:r>
             <w:r>
               <w:rPr>
                 <w:b/>
@@ -11783,14 +11507,12 @@
                 <w:b/>
               </w:rPr>
             </w:pPr>
-            <w:proofErr w:type="spellStart"/>
             <w:r>
               <w:rPr>
                 <w:b/>
               </w:rPr>
               <w:t>logout</w:t>
             </w:r>
-            <w:proofErr w:type="spellEnd"/>
           </w:p>
         </w:tc>
       </w:tr>
@@ -12795,18 +12517,10 @@
         <w:t xml:space="preserve">Una vez llevada a cabo la normalización, teniendo en </w:t>
       </w:r>
       <w:r>
-        <w:t>cuenta hasta la forma de Boyce-</w:t>
-      </w:r>
-      <w:proofErr w:type="spellStart"/>
-      <w:r>
-        <w:t>C</w:t>
-      </w:r>
-      <w:r>
-        <w:t>ood</w:t>
-      </w:r>
-      <w:proofErr w:type="spellEnd"/>
-      <w:r>
-        <w:t>, el resultado es el siguiente:</w:t>
+        <w:t>cuenta hasta la forma de Boyce-C</w:t>
+      </w:r>
+      <w:r>
+        <w:t>ood, el resultado es el siguiente:</w:t>
       </w:r>
     </w:p>
     <w:p>
@@ -12872,38 +12586,15 @@
       <w:r>
         <w:t xml:space="preserve">: </w:t>
       </w:r>
-      <w:proofErr w:type="spellStart"/>
       <w:r>
         <w:rPr>
           <w:u w:val="single"/>
         </w:rPr>
         <w:t>isbn</w:t>
       </w:r>
-      <w:proofErr w:type="spellEnd"/>
-      <w:r>
-        <w:t xml:space="preserve">, titulo, autor, </w:t>
-      </w:r>
-      <w:proofErr w:type="spellStart"/>
-      <w:r>
-        <w:t>numero_ejemplares</w:t>
-      </w:r>
-      <w:proofErr w:type="spellEnd"/>
-      <w:r>
-        <w:t xml:space="preserve">, </w:t>
-      </w:r>
-      <w:proofErr w:type="spellStart"/>
-      <w:r>
-        <w:t>id_materia</w:t>
-      </w:r>
-      <w:proofErr w:type="spellEnd"/>
-      <w:r>
-        <w:t xml:space="preserve">, </w:t>
-      </w:r>
-      <w:proofErr w:type="spellStart"/>
-      <w:r>
-        <w:t>id_curso</w:t>
-      </w:r>
-      <w:proofErr w:type="spellEnd"/>
+      <w:r>
+        <w:t>, titulo, autor, numero_ejemplares, id_materia, id_curso</w:t>
+      </w:r>
     </w:p>
     <w:p>
       <w:pPr>
@@ -12933,7 +12624,6 @@
       <w:pPr>
         <w:ind w:left="567"/>
       </w:pPr>
-      <w:proofErr w:type="spellStart"/>
       <w:r>
         <w:rPr>
           <w:b/>
@@ -12941,72 +12631,17 @@
         </w:rPr>
         <w:t>AlumnosCursosLibros</w:t>
       </w:r>
-      <w:proofErr w:type="spellEnd"/>
       <w:r>
         <w:t xml:space="preserve">: </w:t>
       </w:r>
-      <w:proofErr w:type="spellStart"/>
       <w:r>
         <w:rPr>
           <w:u w:val="single"/>
         </w:rPr>
-        <w:t>isbn</w:t>
-      </w:r>
-      <w:proofErr w:type="spellEnd"/>
-      <w:r>
-        <w:rPr>
-          <w:u w:val="single"/>
-        </w:rPr>
-        <w:t xml:space="preserve">, </w:t>
-      </w:r>
-      <w:proofErr w:type="spellStart"/>
-      <w:r>
-        <w:rPr>
-          <w:u w:val="single"/>
-        </w:rPr>
-        <w:t>id_alumno</w:t>
-      </w:r>
-      <w:proofErr w:type="spellEnd"/>
-      <w:r>
-        <w:rPr>
-          <w:u w:val="single"/>
-        </w:rPr>
-        <w:t xml:space="preserve">, </w:t>
-      </w:r>
-      <w:proofErr w:type="spellStart"/>
-      <w:r>
-        <w:rPr>
-          <w:u w:val="single"/>
-        </w:rPr>
-        <w:t>id_curso</w:t>
-      </w:r>
-      <w:proofErr w:type="spellEnd"/>
-      <w:r>
-        <w:t xml:space="preserve">, </w:t>
-      </w:r>
-      <w:proofErr w:type="spellStart"/>
-      <w:r>
-        <w:t>fecha_entrega</w:t>
-      </w:r>
-      <w:proofErr w:type="spellEnd"/>
-      <w:r>
-        <w:t xml:space="preserve">, </w:t>
-      </w:r>
-      <w:proofErr w:type="spellStart"/>
-      <w:r>
-        <w:t>fecha_devolucion</w:t>
-      </w:r>
-      <w:proofErr w:type="spellEnd"/>
-      <w:r>
-        <w:t xml:space="preserve">, estado (entregado, </w:t>
-      </w:r>
-      <w:proofErr w:type="spellStart"/>
-      <w:r>
-        <w:t>por_devolver</w:t>
-      </w:r>
-      <w:proofErr w:type="spellEnd"/>
-      <w:r>
-        <w:t>)</w:t>
+        <w:t>isbn, id_alumno, id_curso</w:t>
+      </w:r>
+      <w:r>
+        <w:t>, fecha_entrega, fecha_devolucion, estado (entregado, por_devolver)</w:t>
       </w:r>
     </w:p>
     <w:p>
@@ -14255,19 +13890,8 @@
                 <w:sz w:val="16"/>
                 <w:szCs w:val="16"/>
               </w:rPr>
-              <w:t xml:space="preserve">Letra del </w:t>
-            </w:r>
-            <w:proofErr w:type="spellStart"/>
-            <w:r>
-              <w:rPr>
-                <w:rFonts w:cstheme="minorHAnsi"/>
-                <w:b/>
-                <w:sz w:val="16"/>
-                <w:szCs w:val="16"/>
-              </w:rPr>
-              <w:t>niev</w:t>
-            </w:r>
-            <w:proofErr w:type="spellEnd"/>
+              <w:t>Letra del niev</w:t>
+            </w:r>
           </w:p>
         </w:tc>
       </w:tr>
@@ -14434,19 +14058,8 @@
                 <w:sz w:val="16"/>
                 <w:szCs w:val="16"/>
               </w:rPr>
-              <w:t>1ºeso, 2</w:t>
-            </w:r>
-            <w:proofErr w:type="gramStart"/>
-            <w:r>
-              <w:rPr>
-                <w:rFonts w:cstheme="minorHAnsi"/>
-                <w:b/>
-                <w:sz w:val="16"/>
-                <w:szCs w:val="16"/>
-              </w:rPr>
-              <w:t>eso….</w:t>
-            </w:r>
-            <w:proofErr w:type="gramEnd"/>
+              <w:t>1ºeso, 2eso….</w:t>
+            </w:r>
           </w:p>
         </w:tc>
       </w:tr>
@@ -14714,7 +14327,6 @@
                 <w:szCs w:val="16"/>
               </w:rPr>
             </w:pPr>
-            <w:proofErr w:type="spellStart"/>
             <w:r>
               <w:rPr>
                 <w:rFonts w:cstheme="minorHAnsi"/>
@@ -14724,7 +14336,6 @@
               </w:rPr>
               <w:t>isbn</w:t>
             </w:r>
-            <w:proofErr w:type="spellEnd"/>
           </w:p>
         </w:tc>
         <w:tc>
@@ -14874,19 +14485,8 @@
                 <w:sz w:val="16"/>
                 <w:szCs w:val="16"/>
               </w:rPr>
-              <w:t xml:space="preserve">Validar formato </w:t>
-            </w:r>
-            <w:proofErr w:type="spellStart"/>
-            <w:r>
-              <w:rPr>
-                <w:rFonts w:cstheme="minorHAnsi"/>
-                <w:b/>
-                <w:sz w:val="16"/>
-                <w:szCs w:val="16"/>
-              </w:rPr>
-              <w:t>isbn</w:t>
-            </w:r>
-            <w:proofErr w:type="spellEnd"/>
+              <w:t>Validar formato isbn</w:t>
+            </w:r>
           </w:p>
         </w:tc>
       </w:tr>
@@ -15209,7 +14809,6 @@
                 <w:szCs w:val="16"/>
               </w:rPr>
             </w:pPr>
-            <w:proofErr w:type="spellStart"/>
             <w:r>
               <w:rPr>
                 <w:rFonts w:cstheme="minorHAnsi"/>
@@ -15219,7 +14818,6 @@
               </w:rPr>
               <w:t>numero_ejemplares</w:t>
             </w:r>
-            <w:proofErr w:type="spellEnd"/>
           </w:p>
         </w:tc>
         <w:tc>
@@ -15370,7 +14968,6 @@
                 <w:szCs w:val="16"/>
               </w:rPr>
             </w:pPr>
-            <w:proofErr w:type="spellStart"/>
             <w:r>
               <w:rPr>
                 <w:rFonts w:cstheme="minorHAnsi"/>
@@ -15380,7 +14977,6 @@
               </w:rPr>
               <w:t>id_materia</w:t>
             </w:r>
-            <w:proofErr w:type="spellEnd"/>
           </w:p>
         </w:tc>
         <w:tc>
@@ -15549,7 +15145,6 @@
                 <w:szCs w:val="16"/>
               </w:rPr>
             </w:pPr>
-            <w:proofErr w:type="spellStart"/>
             <w:r>
               <w:rPr>
                 <w:rFonts w:cstheme="minorHAnsi"/>
@@ -15559,7 +15154,6 @@
               </w:rPr>
               <w:t>id_curso</w:t>
             </w:r>
-            <w:proofErr w:type="spellEnd"/>
           </w:p>
         </w:tc>
         <w:tc>
@@ -16657,27 +16251,7 @@
                 <w:sz w:val="16"/>
                 <w:szCs w:val="16"/>
               </w:rPr>
-              <w:t xml:space="preserve">0, I, </w:t>
-            </w:r>
-            <w:proofErr w:type="gramStart"/>
-            <w:r>
-              <w:rPr>
-                <w:rFonts w:cstheme="minorHAnsi"/>
-                <w:b/>
-                <w:sz w:val="16"/>
-                <w:szCs w:val="16"/>
-              </w:rPr>
-              <w:t>II  (</w:t>
-            </w:r>
-            <w:proofErr w:type="gramEnd"/>
-            <w:r>
-              <w:rPr>
-                <w:rFonts w:cstheme="minorHAnsi"/>
-                <w:b/>
-                <w:sz w:val="16"/>
-                <w:szCs w:val="16"/>
-              </w:rPr>
-              <w:t>0 para no beca, tramo I y II)</w:t>
+              <w:t>0, I, II  (0 para no beca, tramo I y II)</w:t>
             </w:r>
           </w:p>
         </w:tc>
@@ -16696,7 +16270,6 @@
                 <w:szCs w:val="16"/>
               </w:rPr>
             </w:pPr>
-            <w:proofErr w:type="spellStart"/>
             <w:r>
               <w:rPr>
                 <w:rFonts w:cstheme="minorHAnsi"/>
@@ -16706,7 +16279,6 @@
               </w:rPr>
               <w:t>bilingue</w:t>
             </w:r>
-            <w:proofErr w:type="spellEnd"/>
           </w:p>
         </w:tc>
         <w:tc>
@@ -16878,7 +16450,6 @@
                 <w:szCs w:val="16"/>
               </w:rPr>
             </w:pPr>
-            <w:proofErr w:type="spellStart"/>
             <w:r>
               <w:rPr>
                 <w:rFonts w:cstheme="minorHAnsi"/>
@@ -16888,7 +16459,6 @@
               </w:rPr>
               <w:t>alumnoscursoslibros</w:t>
             </w:r>
-            <w:proofErr w:type="spellEnd"/>
           </w:p>
         </w:tc>
       </w:tr>
@@ -17490,7 +17060,6 @@
                 <w:szCs w:val="16"/>
               </w:rPr>
             </w:pPr>
-            <w:proofErr w:type="spellStart"/>
             <w:r>
               <w:rPr>
                 <w:rFonts w:cstheme="minorHAnsi"/>
@@ -17500,7 +17069,6 @@
               </w:rPr>
               <w:t>isbn</w:t>
             </w:r>
-            <w:proofErr w:type="spellEnd"/>
           </w:p>
         </w:tc>
         <w:tc>
@@ -17678,7 +17246,6 @@
                 <w:szCs w:val="16"/>
               </w:rPr>
             </w:pPr>
-            <w:proofErr w:type="spellStart"/>
             <w:r>
               <w:rPr>
                 <w:rFonts w:cstheme="minorHAnsi"/>
@@ -17697,7 +17264,6 @@
               </w:rPr>
               <w:t>echa_entrega</w:t>
             </w:r>
-            <w:proofErr w:type="spellEnd"/>
           </w:p>
         </w:tc>
         <w:tc>
@@ -17848,7 +17414,6 @@
                 <w:szCs w:val="16"/>
               </w:rPr>
             </w:pPr>
-            <w:proofErr w:type="spellStart"/>
             <w:r>
               <w:rPr>
                 <w:rFonts w:cstheme="minorHAnsi"/>
@@ -17885,7 +17450,6 @@
               </w:rPr>
               <w:t>evolución</w:t>
             </w:r>
-            <w:proofErr w:type="spellEnd"/>
           </w:p>
         </w:tc>
         <w:tc>
@@ -18158,19 +17722,8 @@
                 <w:sz w:val="16"/>
                 <w:szCs w:val="16"/>
               </w:rPr>
-              <w:t xml:space="preserve">P: Prestado, </w:t>
-            </w:r>
-            <w:proofErr w:type="gramStart"/>
-            <w:r>
-              <w:rPr>
-                <w:rFonts w:cstheme="minorHAnsi"/>
-                <w:b/>
-                <w:sz w:val="16"/>
-                <w:szCs w:val="16"/>
-              </w:rPr>
-              <w:t>D:Devuelto</w:t>
-            </w:r>
-            <w:proofErr w:type="gramEnd"/>
+              <w:t>P: Prestado, D:Devuelto</w:t>
+            </w:r>
           </w:p>
         </w:tc>
       </w:tr>
@@ -18210,27 +17763,7 @@
           <w:sz w:val="24"/>
           <w:szCs w:val="24"/>
         </w:rPr>
-        <w:t>El programa está estructurado en diferentes archivos .</w:t>
-      </w:r>
-      <w:proofErr w:type="spellStart"/>
-      <w:r>
-        <w:rPr>
-          <w:rFonts w:eastAsiaTheme="minorEastAsia" w:cstheme="minorBidi"/>
-          <w:b w:val="0"/>
-          <w:sz w:val="24"/>
-          <w:szCs w:val="24"/>
-        </w:rPr>
-        <w:t>py</w:t>
-      </w:r>
-      <w:proofErr w:type="spellEnd"/>
-      <w:r>
-        <w:rPr>
-          <w:rFonts w:eastAsiaTheme="minorEastAsia" w:cstheme="minorBidi"/>
-          <w:b w:val="0"/>
-          <w:sz w:val="24"/>
-          <w:szCs w:val="24"/>
-        </w:rPr>
-        <w:t xml:space="preserve">, donde se registra cada una de las clases necesarias para su funcionamiento. La organización del proyecto sigue una estructura modular, lo que </w:t>
+        <w:t xml:space="preserve">El programa está estructurado en diferentes archivos .py, donde se registra cada una de las clases necesarias para su funcionamiento. La organización del proyecto sigue una estructura modular, lo que </w:t>
       </w:r>
       <w:r>
         <w:rPr>
@@ -18260,27 +17793,7 @@
           <w:sz w:val="24"/>
           <w:szCs w:val="24"/>
         </w:rPr>
-        <w:t>El almacenamiento de los datos se realiza mediante archivos de texto plano (.</w:t>
-      </w:r>
-      <w:proofErr w:type="spellStart"/>
-      <w:r>
-        <w:rPr>
-          <w:rFonts w:eastAsiaTheme="minorEastAsia" w:cstheme="minorBidi"/>
-          <w:b w:val="0"/>
-          <w:sz w:val="24"/>
-          <w:szCs w:val="24"/>
-        </w:rPr>
-        <w:t>txt</w:t>
-      </w:r>
-      <w:proofErr w:type="spellEnd"/>
-      <w:r>
-        <w:rPr>
-          <w:rFonts w:eastAsiaTheme="minorEastAsia" w:cstheme="minorBidi"/>
-          <w:b w:val="0"/>
-          <w:sz w:val="24"/>
-          <w:szCs w:val="24"/>
-        </w:rPr>
-        <w:t>), que actúan como una base de datos sencilla y adecuada para las necesidades del programa. Estos archivos permiten guardar información de forma persistente sin necesidad de utilizar sistemas más complejos.</w:t>
+        <w:t>El almacenamiento de los datos se realiza mediante archivos de texto plano (.txt), que actúan como una base de datos sencilla y adecuada para las necesidades del programa. Estos archivos permiten guardar información de forma persistente sin necesidad de utilizar sistemas más complejos.</w:t>
       </w:r>
     </w:p>
     <w:p>
@@ -18293,7 +17806,6 @@
           <w:szCs w:val="24"/>
         </w:rPr>
       </w:pPr>
-      <w:proofErr w:type="spellStart"/>
       <w:r>
         <w:rPr>
           <w:rFonts w:eastAsiaTheme="minorEastAsia" w:cstheme="minorBidi"/>
@@ -18301,17 +17813,7 @@
           <w:sz w:val="24"/>
           <w:szCs w:val="24"/>
         </w:rPr>
-        <w:t>ProgramaPrestamoLibros</w:t>
-      </w:r>
-      <w:proofErr w:type="spellEnd"/>
-      <w:r>
-        <w:rPr>
-          <w:rFonts w:eastAsiaTheme="minorEastAsia" w:cstheme="minorBidi"/>
-          <w:b w:val="0"/>
-          <w:sz w:val="24"/>
-          <w:szCs w:val="24"/>
-        </w:rPr>
-        <w:t>/</w:t>
+        <w:t>ProgramaPrestamoLibros/</w:t>
       </w:r>
     </w:p>
     <w:p>
@@ -18821,27 +18323,7 @@
           <w:sz w:val="24"/>
           <w:szCs w:val="24"/>
         </w:rPr>
-        <w:t xml:space="preserve">      |---- app.py</w:t>
-      </w:r>
-      <w:proofErr w:type="gramStart"/>
-      <w:r>
-        <w:rPr>
-          <w:rFonts w:eastAsiaTheme="minorEastAsia" w:cstheme="minorBidi"/>
-          <w:b w:val="0"/>
-          <w:sz w:val="24"/>
-          <w:szCs w:val="24"/>
-        </w:rPr>
-        <w:t xml:space="preserve">   (</w:t>
-      </w:r>
-      <w:proofErr w:type="gramEnd"/>
-      <w:r>
-        <w:rPr>
-          <w:rFonts w:eastAsiaTheme="minorEastAsia" w:cstheme="minorBidi"/>
-          <w:b w:val="0"/>
-          <w:sz w:val="24"/>
-          <w:szCs w:val="24"/>
-        </w:rPr>
-        <w:t>o main.py)</w:t>
+        <w:t xml:space="preserve">      |---- app.py   (o main.py)</w:t>
       </w:r>
     </w:p>
     <w:p>
@@ -18878,15 +18360,7 @@
     </w:p>
     <w:p>
       <w:r>
-        <w:t>Para la organización del programa se opta por almacenar la información en ficheros de texto plano (.</w:t>
-      </w:r>
-      <w:proofErr w:type="spellStart"/>
-      <w:r>
-        <w:t>txt</w:t>
-      </w:r>
-      <w:proofErr w:type="spellEnd"/>
-      <w:r>
-        <w:t>). Al iniciarse, la aplicación solicita un usuario y contraseña, que se validan con el fichero usuarios.txt. Este sistema de autenticación permite controlar el acceso sin necesidad de una base de datos compleja. Todos los ficheros se encuentran en la carpeta /datos/ del proyecto.</w:t>
+        <w:t>Para la organización del programa se opta por almacenar la información en ficheros de texto plano (.txt). Al iniciarse, la aplicación solicita un usuario y contraseña, que se validan con el fichero usuarios.txt. Este sistema de autenticación permite controlar el acceso sin necesidad de una base de datos compleja. Todos los ficheros se encuentran en la carpeta /datos/ del proyecto.</w:t>
       </w:r>
     </w:p>
     <w:p>
@@ -19037,21 +18511,8 @@
     </w:p>
     <w:p>
       <w:r>
-        <w:t xml:space="preserve">    contrato_&lt;</w:t>
-      </w:r>
-      <w:proofErr w:type="spellStart"/>
-      <w:r>
-        <w:t>IDAlumno</w:t>
-      </w:r>
-      <w:proofErr w:type="spellEnd"/>
-      <w:r>
-        <w:t>&gt;.</w:t>
-      </w:r>
-      <w:proofErr w:type="spellStart"/>
-      <w:r>
-        <w:t>txt</w:t>
-      </w:r>
-      <w:proofErr w:type="spellEnd"/>
+        <w:t xml:space="preserve">    contrato_&lt;IDAlumno&gt;.txt</w:t>
+      </w:r>
     </w:p>
     <w:p/>
     <w:p>
@@ -19424,48 +18885,20 @@
         <w:rPr>
           <w:color w:val="FF0000"/>
         </w:rPr>
-        <w:t xml:space="preserve">¿Dónde va a estar la información? Decidir si va a estar en un fichero, o una </w:t>
-      </w:r>
-      <w:proofErr w:type="spellStart"/>
-      <w:r>
+        <w:t xml:space="preserve">¿Dónde va a estar la información? Decidir si va a estar en un fichero, o una bbdd o le pido al usuario cada vez q se conecte. </w:t>
+      </w:r>
+    </w:p>
+    <w:p>
+      <w:pPr>
         <w:rPr>
           <w:color w:val="FF0000"/>
         </w:rPr>
-        <w:t>bbdd</w:t>
-      </w:r>
-      <w:proofErr w:type="spellEnd"/>
+      </w:pPr>
       <w:r>
         <w:rPr>
           <w:color w:val="FF0000"/>
         </w:rPr>
-        <w:t xml:space="preserve"> o le pido al usuario cada vez q se conecte. </w:t>
-      </w:r>
-    </w:p>
-    <w:p>
-      <w:pPr>
-        <w:rPr>
-          <w:color w:val="FF0000"/>
-        </w:rPr>
-      </w:pPr>
-      <w:r>
-        <w:rPr>
-          <w:color w:val="FF0000"/>
-        </w:rPr>
-        <w:t xml:space="preserve">Fichero, que estructura tiene los que vamos a usar nosotros. La estructura la tenemos más abajo, de </w:t>
-      </w:r>
-      <w:proofErr w:type="spellStart"/>
-      <w:r>
-        <w:rPr>
-          <w:color w:val="FF0000"/>
-        </w:rPr>
-        <w:t>Delphos</w:t>
-      </w:r>
-      <w:proofErr w:type="spellEnd"/>
-      <w:r>
-        <w:rPr>
-          <w:color w:val="FF0000"/>
-        </w:rPr>
-        <w:t xml:space="preserve">. </w:t>
+        <w:t xml:space="preserve">Fichero, que estructura tiene los que vamos a usar nosotros. La estructura la tenemos más abajo, de Delphos. </w:t>
       </w:r>
     </w:p>
     <w:p>
@@ -19487,6 +18920,19 @@
           <w:color w:val="FF0000"/>
         </w:rPr>
       </w:pPr>
+    </w:p>
+    <w:p>
+      <w:pPr>
+        <w:rPr>
+          <w:color w:val="FF0000"/>
+        </w:rPr>
+      </w:pPr>
+      <w:r>
+        <w:rPr>
+          <w:color w:val="FF0000"/>
+        </w:rPr>
+        <w:t>Este punto “está acabado, le queda poco”</w:t>
+      </w:r>
     </w:p>
     <w:p/>
     <w:p>
@@ -19567,21 +19013,7 @@
         <w:rPr>
           <w:color w:val="FF0000"/>
         </w:rPr>
-        <w:t xml:space="preserve">Habrá diagrama de </w:t>
-      </w:r>
-      <w:proofErr w:type="gramStart"/>
-      <w:r>
-        <w:rPr>
-          <w:color w:val="FF0000"/>
-        </w:rPr>
-        <w:t>app</w:t>
-      </w:r>
-      <w:proofErr w:type="gramEnd"/>
-      <w:r>
-        <w:rPr>
-          <w:color w:val="FF0000"/>
-        </w:rPr>
-        <w:t xml:space="preserve">, de menú. Todas las clases que yo necesito para gestionar mi aplicación. </w:t>
+        <w:t xml:space="preserve">Habrá diagrama de app, de menú. Todas las clases que yo necesito para gestionar mi aplicación. </w:t>
       </w:r>
     </w:p>
     <w:p/>
@@ -25142,6 +24574,7 @@
   <w:style w:type="character" w:default="1" w:styleId="Fuentedeprrafopredeter">
     <w:name w:val="Default Paragraph Font"/>
     <w:uiPriority w:val="1"/>
+    <w:semiHidden/>
     <w:unhideWhenUsed/>
   </w:style>
   <w:style w:type="table" w:default="1" w:styleId="Tablanormal">
@@ -26468,6 +25901,7 @@
     <w:rsidRoot w:val="00963B15"/>
     <w:rsid w:val="0001781A"/>
     <w:rsid w:val="0002148D"/>
+    <w:rsid w:val="00040AE9"/>
     <w:rsid w:val="00050043"/>
     <w:rsid w:val="00081F3B"/>
     <w:rsid w:val="000B76EC"/>
@@ -26540,6 +25974,7 @@
     <w:rsid w:val="00AC11EA"/>
     <w:rsid w:val="00AD281D"/>
     <w:rsid w:val="00B444FF"/>
+    <w:rsid w:val="00B744E1"/>
     <w:rsid w:val="00B8045E"/>
     <w:rsid w:val="00BA03CE"/>
     <w:rsid w:val="00BB60B5"/>

</xml_diff>